<commit_message>
Prep for design, add Flux pro
</commit_message>
<xml_diff>
--- a/docs/C2C_v3_Engineering_Spec.docx
+++ b/docs/C2C_v3_Engineering_Spec.docx
@@ -1156,7 +1156,7 @@
           <w:sz w:val="20"/>
           <w:szCs w:val="20"/>
         </w:rPr>
-        <w:t>Wireframes approved by Lauren before Phase 3 build begins. Design is not an engineering decision.</w:t>
+        <w:t>Core brand color: RGB(37 99 235) / #2563eb. Tenant branding may override tenant-specific surfaces where configured.</w:t>
       </w:r>
     </w:p>
     <w:p ns2:paraId="41C0B101" ns2:textId="77777777">
@@ -3369,7 +3369,7 @@
               <w:rPr>
                 <w:color w:val="000000"/>
               </w:rPr>
-              <w:t xml:space="preserve"> from blank canvas. Role-based dashboards (agent, coordinator, broker/admin, back-office). Flat one-click navigation to every section. Affiliated/white-label partner tabs visible by name on dashboard. Global search. Notification badge. Mobile-first responsive. Usability gate: new user finds any feature in 30 seconds without training. Component library and design system established — all subsequent phases conform to it. Wireframes approved by Lauren before build begins.</w:t>
+              <w:t xml:space="preserve"> from blank canvas. Role-based dashboards (agent, coordinator, broker/admin, back-office). Flat one-click navigation to every section. Affiliated/white-label partner tabs visible by name on dashboard. Global search. Notification badge. Mobile-first responsive. Usability gate: new user finds any feature in 30 seconds without training. Component library and design system established — all subsequent phases conform to it. Use the approved P3 design references for app structure and visual sensibility.</w:t>
             </w:r>
           </w:p>
         </w:tc>
@@ -5958,7 +5958,7 @@
           <w:sz w:val="20"/>
           <w:szCs w:val="20"/>
         </w:rPr>
-        <w:t>Wireframes approved by Lauren before build begins.</w:t>
+        <w:t>Use the approved P3 design references for app structure and visual sensibility.</w:t>
       </w:r>
     </w:p>
     <w:p ns2:paraId="77D34905" ns2:textId="77777777">
@@ -7611,7 +7611,7 @@
           </w:tcPr>
           <w:p ns2:paraId="16CEE983" ns2:textId="77777777">
             <w:r>
-              <w:t>UX design must run alongside Phase 1–2 engineering; wireframes approved by Lauren before Phase 3 build begins</w:t>
+              <w:t>UX design direction is informed by the provided P3 reference screenshots and the core C2C brand color.</w:t>
             </w:r>
           </w:p>
         </w:tc>
@@ -8871,7 +8871,7 @@
         <w:spacing w:after="80"/>
       </w:pPr>
       <w:r>
-        <w:t>Dashboard wireframes approved by Lauren before Phase 3 build begins — design is not an engineering decision</w:t>
+        <w:t>Dashboard design follows the provided P3 UI references: Mailchimp-inspired app structure with Granola-inspired visual sensibility</w:t>
       </w:r>
     </w:p>
     <w:p ns2:paraId="082AE023" ns2:textId="77777777">

</xml_diff>